<commit_message>
Update enterprise registration knowledge and attach cited workflow diagrams
</commit_message>
<xml_diff>
--- a/knowledge_sources/SmartTITU客户问答.docx
+++ b/knowledge_sources/SmartTITU客户问答.docx
@@ -14,7 +14,7 @@
       <w:r>
         <w:t>文档编号：smarttitu-customer-faq</w:t>
         <w:br/>
-        <w:t>版本：2026-10-22 v1</w:t>
+        <w:t>版本：2026-10-22 v2</w:t>
         <w:br/>
         <w:t>适用范围：客户产品咨询与基础调用排查</w:t>
       </w:r>
@@ -57,7 +57,7 @@
         <w:pStyle w:val="Heading1"/>
       </w:pPr>
       <w:r>
-        <w:t>如何开通企业账号</w:t>
+        <w:t>如何注册和登录企业账号</w:t>
       </w:r>
     </w:p>
     <w:p>
@@ -65,7 +65,19 @@
         <w:keepNext/>
       </w:pPr>
       <w:r>
-        <w:t>企业账号由运营团队预创建，客户经理交付账号和初始密码。首次使用通常依次完成登录、修改初始密码、企业认证、开通服务、创建 API 密钥和发起调用。</w:t>
+        <w:t>在登录页面填写手机号和验证码，提交登录。系统根据过往手机号信息判断是否已注册。新客户会看到注册页面，按页面要求填写企业注册信息并提交，系统保存资料、完成注册后进入工作台。已经注册的客户登录成功后直接进入工作台。进入工作台后，尚未认证的企业需要继续办理企业认证，认证完成后方可领取试用套餐及订购正式套餐。</w:t>
+      </w:r>
+    </w:p>
+    <w:p>
+      <w:pPr>
+        <w:keepNext/>
+      </w:pPr>
+      <w:r>
+        <w:rPr>
+          <w:color w:val="616161"/>
+          <w:sz w:val="16"/>
+        </w:rPr>
+        <w:t>配图：enterprise-register</w:t>
       </w:r>
     </w:p>
     <w:p>
@@ -77,7 +89,47 @@
           <w:color w:val="616161"/>
           <w:sz w:val="16"/>
         </w:rPr>
-        <w:t>来源：7.SmartTITU销售常见问题速查FAQ-20261008v1.pdf，物理第1页。</w:t>
+        <w:t>来源：flowchart-transposed.html，企业客户注册、登录及企业认证业务流程图。</w:t>
+      </w:r>
+    </w:p>
+    <w:p>
+      <w:pPr>
+        <w:pStyle w:val="Heading1"/>
+      </w:pPr>
+      <w:r>
+        <w:t>企业注册需要填写哪些信息</w:t>
+      </w:r>
+    </w:p>
+    <w:p>
+      <w:pPr>
+        <w:keepNext/>
+      </w:pPr>
+      <w:r>
+        <w:t>新客户在注册页面按要求填写企业名称、组织机构代码证、行业、行业分类、推荐客户经理和公司地址等企业信息。填写完成后提交，系统保存企业客户资料并完成注册。具体填写要求按当前注册页面指引操作。</w:t>
+      </w:r>
+    </w:p>
+    <w:p>
+      <w:pPr>
+        <w:keepNext/>
+      </w:pPr>
+      <w:r>
+        <w:rPr>
+          <w:color w:val="616161"/>
+          <w:sz w:val="16"/>
+        </w:rPr>
+        <w:t>配图：enterprise-register</w:t>
+      </w:r>
+    </w:p>
+    <w:p>
+      <w:pPr>
+        <w:spacing w:after="120"/>
+      </w:pPr>
+      <w:r>
+        <w:rPr>
+          <w:color w:val="616161"/>
+          <w:sz w:val="16"/>
+        </w:rPr>
+        <w:t>来源：flowchart-transposed.html，企业客户注册、登录及企业认证业务流程图。</w:t>
       </w:r>
     </w:p>
     <w:p>
@@ -93,7 +145,19 @@
         <w:keepNext/>
       </w:pPr>
       <w:r>
-        <w:t>企业认证由运营团队依据企业资质材料线下审核。请联系专属客户经理提交所需材料；通过后企业名称旁会显示已认证标识。审核时间及要求以当前办理流程为准。</w:t>
+        <w:t>登录工作台后，系统判断企业是否已完成认证；未认证时会提示继续办理。企业可选择在线或线下认证：在线认证按页面提供的法大大或 e签宝指引完成；线下认证联系客户经理或致电热线，由客户经理受理并协助完成。企业认证完成后，方可领取试用套餐及订购正式套餐。</w:t>
+      </w:r>
+    </w:p>
+    <w:p>
+      <w:pPr>
+        <w:keepNext/>
+      </w:pPr>
+      <w:r>
+        <w:rPr>
+          <w:color w:val="616161"/>
+          <w:sz w:val="16"/>
+        </w:rPr>
+        <w:t>配图：enterprise-register</w:t>
       </w:r>
     </w:p>
     <w:p>
@@ -105,7 +169,7 @@
           <w:color w:val="616161"/>
           <w:sz w:val="16"/>
         </w:rPr>
-        <w:t>来源：7.SmartTITU销售常见问题速查FAQ-20261008v1.pdf，物理第1页。</w:t>
+        <w:t>来源：flowchart-transposed.html，企业客户注册、登录及企业认证业务流程图。</w:t>
       </w:r>
     </w:p>
     <w:p>
@@ -528,10 +592,68 @@
         <w:t>来源：7.SmartTITU销售常见问题速查FAQ-20261008v1.pdf，物理第13至14页。</w:t>
       </w:r>
     </w:p>
+    <w:p>
+      <w:r>
+        <w:br w:type="page"/>
+      </w:r>
+    </w:p>
+    <w:p>
+      <w:pPr>
+        <w:pStyle w:val="Heading1"/>
+      </w:pPr>
+      <w:r>
+        <w:t>企业注册与认证流程图</w:t>
+      </w:r>
+    </w:p>
+    <w:p>
+      <w:r>
+        <w:drawing>
+          <wp:inline xmlns:a="http://schemas.openxmlformats.org/drawingml/2006/main" xmlns:pic="http://schemas.openxmlformats.org/drawingml/2006/picture">
+            <wp:extent cx="5669280" cy="5015132"/>
+            <wp:docPr id="1" name="Picture 1"/>
+            <wp:cNvGraphicFramePr>
+              <a:graphicFrameLocks noChangeAspect="1"/>
+            </wp:cNvGraphicFramePr>
+            <a:graphic>
+              <a:graphicData uri="http://schemas.openxmlformats.org/drawingml/2006/picture">
+                <pic:pic>
+                  <pic:nvPicPr>
+                    <pic:cNvPr id="0" name="enterprise-register.png"/>
+                    <pic:cNvPicPr/>
+                  </pic:nvPicPr>
+                  <pic:blipFill>
+                    <a:blip r:embed="rId9"/>
+                    <a:stretch>
+                      <a:fillRect/>
+                    </a:stretch>
+                  </pic:blipFill>
+                  <pic:spPr>
+                    <a:xfrm>
+                      <a:off x="0" y="0"/>
+                      <a:ext cx="5669280" cy="5015132"/>
+                    </a:xfrm>
+                    <a:prstGeom prst="rect"/>
+                  </pic:spPr>
+                </pic:pic>
+              </a:graphicData>
+            </a:graphic>
+          </wp:inline>
+        </w:drawing>
+      </w:r>
+    </w:p>
+    <w:p>
+      <w:r>
+        <w:rPr>
+          <w:color w:val="616161"/>
+          <w:sz w:val="16"/>
+        </w:rPr>
+        <w:t>来源：flowchart-transposed.html，企业客户注册、登录及企业认证业务流程图。</w:t>
+      </w:r>
+    </w:p>
     <w:sectPr>
-      <w:footerReference w:type="default" r:id="rId9"/>
-      <w:pgSz w:w="12240" w:h="15840"/>
-      <w:pgMar w:top="1008" w:right="1152" w:bottom="1008" w:left="1152" w:header="720" w:footer="720" w:gutter="0"/>
+      <w:footerReference w:type="default" r:id="rId10"/>
+      <w:pgSz w:w="11909" w:h="16834"/>
+      <w:pgMar w:top="936" w:right="1152" w:bottom="936" w:left="1152" w:header="720" w:footer="720" w:gutter="0"/>
       <w:cols w:space="720"/>
       <w:docGrid w:linePitch="360"/>
     </w:sectPr>
@@ -915,7 +1037,7 @@
     <w:qFormat/>
     <w:rsid w:val="00FC693F"/>
     <w:pPr>
-      <w:spacing w:after="80" w:line="264" w:lineRule="auto"/>
+      <w:spacing w:after="60" w:line="259" w:lineRule="auto"/>
     </w:pPr>
     <w:rPr>
       <w:rFonts w:ascii="Arial Unicode MS" w:hAnsi="Arial Unicode MS" w:eastAsia="Arial Unicode MS"/>
@@ -978,7 +1100,7 @@
     <w:pPr>
       <w:keepNext/>
       <w:keepLines/>
-      <w:spacing w:before="200" w:after="80"/>
+      <w:spacing w:before="160" w:after="60"/>
       <w:outlineLvl w:val="0"/>
     </w:pPr>
     <w:rPr>

</xml_diff>